<commit_message>
Remove heading divider lines from the Word outline
Co-Authored-By: Claude Opus 5.5 <noreply@anthropic.com>
Claude-Session: https://claude.ai/code/session_011EwNtrshVPAYiZJ42qCB4w
</commit_message>
<xml_diff>
--- a/我那少年夫君一刀一个穿书女/漫剧大纲.docx
+++ b/我那少年夫君一刀一个穿书女/漫剧大纲.docx
@@ -37,9 +37,6 @@
     <w:p>
       <w:pPr>
         <w:pStyle w:val="Heading1"/>
-        <w:pBdr>
-          <w:bottom w:val="single" w:color="999999" w:sz="6" w:space="4"/>
-        </w:pBdr>
         <w:spacing w:after="160" w:before="360"/>
       </w:pPr>
       <w:r>
@@ -72,9 +69,6 @@
     <w:p>
       <w:pPr>
         <w:pStyle w:val="Heading1"/>
-        <w:pBdr>
-          <w:bottom w:val="single" w:color="999999" w:sz="6" w:space="4"/>
-        </w:pBdr>
         <w:spacing w:after="160" w:before="360"/>
       </w:pPr>
       <w:r>
@@ -1427,9 +1421,6 @@
     <w:p>
       <w:pPr>
         <w:pStyle w:val="Heading1"/>
-        <w:pBdr>
-          <w:bottom w:val="single" w:color="999999" w:sz="6" w:space="4"/>
-        </w:pBdr>
         <w:spacing w:after="160" w:before="360"/>
       </w:pPr>
       <w:r>

</xml_diff>